<commit_message>
Incorporated changes to coexistence discussed with Jamie and Michelle following PNZ review.
</commit_message>
<xml_diff>
--- a/dist/docx/coexistence.docx
+++ b/dist/docx/coexistence.docx
@@ -2231,7 +2231,7 @@
               </w:numPr>
             </w:pPr>
             <w:r>
-              <w:t>Participants that receive MX pain messages from their customers destined for another participant should create an MX payment message for that instruction;</w:t>
+              <w:t>Participants that receive MX pain messages from their customers destined for another HVCS participant must create an MX payment message for that instruction;</w:t>
             </w:r>
           </w:p>
           <w:p>
@@ -3302,6 +3302,16 @@
               <w:t>It is possible that some MT payment messages which were sent before 22 November 2025 may be received by participants for a short period on or after 22 November 2025, for example, if an MT payment message took longer than expected to be sent through SWIFT's messaging system.</w:t>
             </w:r>
           </w:p>
+          <w:p>
+            <w:r>
+              <w:t>Payments NZ discussed with the ISO 20022 Industry and Operational Working Group (ORWG) that during the window immediately following go-live, Participants may receive MT payments from SWIFT that were held in a SWIFT outbound sanctions queue at the time of go-live 22 November. These may be any of the MT payment types or their return variants. Some Participants may be able to receive and process the incoming MT payment instruction; some may not and would be forced to reject the payment instruction. If the payment was accepted, and subsequently needed to be returned, it would have to be returned as a pacs.004.</w:t>
+            </w:r>
+          </w:p>
+          <w:p>
+            <w:r>
+              <w:t>Payments NZ are highlighting the potential to receive these MT instructions though expect volumes will be low to none. Payments NZ to not expect any Participant to build capability to handle this scenario and any occurrences to be handled manually via operations teams.</w:t>
+            </w:r>
+          </w:p>
         </w:tc>
       </w:tr>
     </w:tbl>

</xml_diff>

<commit_message>
Revised content and formatting of PDF documents (created from HTML) for Board approval.
</commit_message>
<xml_diff>
--- a/dist/docx/coexistence.docx
+++ b/dist/docx/coexistence.docx
@@ -555,6 +555,20 @@
           </w:p>
           <w:p>
             <w:r>
+              <w:rPr>
+                <w:b/>
+              </w:rPr>
+              <w:t>Hybrid Postal Address</w:t>
+            </w:r>
+            <w:r>
+              <w:t xml:space="preserve"> </w:t>
+            </w:r>
+            <w:r>
+              <w:t>formatting means when the content of the address information within an MX message is formatted in accordance with the hybrid data requirements set out in the MX Message Specifications.</w:t>
+            </w:r>
+          </w:p>
+          <w:p>
+            <w:r>
               <w:t>in November 2026; or</w:t>
             </w:r>
           </w:p>
@@ -647,20 +661,6 @@
             </w:r>
             <w:r>
               <w:t>means when the content of the address information within an MX message is not formatted in accordance with the structured data requirements set out in the MX Message Specifications.</w:t>
-            </w:r>
-          </w:p>
-          <w:p>
-            <w:r>
-              <w:rPr>
-                <w:b/>
-              </w:rPr>
-              <w:t>Hybrid Address Line formatting</w:t>
-            </w:r>
-            <w:r>
-              <w:t xml:space="preserve"> </w:t>
-            </w:r>
-            <w:r>
-              <w:t>means when the content of the address information within an MX message is formatted in accordance with the hybrid data requirements set out in the MX Message Specifications.</w:t>
             </w:r>
           </w:p>
           <w:p>
@@ -821,7 +821,7 @@
           </w:p>
           <w:p>
             <w:r>
-              <w:t>Participants must be able to receive and process MX messages that use hybrid postal address formatting.</w:t>
+              <w:t>Participants must be able to receive and process MX messages that use Hybrid Postal Address formatting.</w:t>
             </w:r>
           </w:p>
           <w:p>
@@ -831,7 +831,7 @@
           </w:p>
           <w:p>
             <w:r>
-              <w:t>Participants must send all messages using either structured postal address formatting or hybrid postal address formatting.</w:t>
+              <w:t>Participants must send all messages using either Structured Postal Address formatting or Hybrid Postal Address formatting.</w:t>
             </w:r>
           </w:p>
         </w:tc>
@@ -843,12 +843,12 @@
           </w:p>
           <w:p>
             <w:r>
-              <w:t>Participants acting as intermediaries must be able to receive and process CBPR+ messages that use hybrid postal address formatting.</w:t>
-            </w:r>
-          </w:p>
-          <w:p>
-            <w:r>
-              <w:t>Participants acting as intermediaries must be able to on-send a CBPR+ message that uses hybrid postal address formatting to participants as an MX message.</w:t>
+              <w:t>Participants acting as intermediaries must be able to receive and process CBPR+ messages that use Hybrid Postal Address formatting.</w:t>
+            </w:r>
+          </w:p>
+          <w:p>
+            <w:r>
+              <w:t>Participants acting as intermediaries must be able to on-send a CBPR+ message that uses Hybrid Postal Address formatting to participants as an MX message.</w:t>
             </w:r>
           </w:p>
           <w:p>
@@ -858,7 +858,7 @@
           </w:p>
           <w:p>
             <w:r>
-              <w:t>Participants acting as intermediaries must send all CBPR+ messages and on-send all CBPR+ messages to participants as an MX message using either structured postal address formatting or hybrid postal address formatting.</w:t>
+              <w:t>Participants acting as intermediaries must send all CBPR+ messages and on-send all CBPR+ messages to participants as an MX message using either structured postal address formatting or Hybrid Postal Address formatting.</w:t>
             </w:r>
           </w:p>
         </w:tc>
@@ -1119,7 +1119,7 @@
           </w:p>
           <w:p>
             <w:r>
-              <w:t>Participants must be able to receive from SWIFT and process as an MX message</w:t>
+              <w:t>Participants must be able to receive from SWIFT as an MX message and process</w:t>
             </w:r>
           </w:p>
         </w:tc>
@@ -1211,7 +1211,7 @@
               </w:numPr>
             </w:pPr>
             <w:r>
-              <w:t>From 22 November 2025, during the co-existence phase, participants must:</w:t>
+              <w:t>From 22 November 2025, during the co-existence phase, any participant as of 22 November 2025 must:</w:t>
             </w:r>
           </w:p>
           <w:p>
@@ -1234,6 +1234,17 @@
             </w:pPr>
             <w:r>
               <w:t>Be a member of the AVP MT CUG until the end of the co-existence phase.</w:t>
+            </w:r>
+          </w:p>
+          <w:p>
+            <w:pPr>
+              <w:numPr>
+                <w:ilvl w:val="1"/>
+                <w:numId w:val="100"/>
+              </w:numPr>
+            </w:pPr>
+            <w:r>
+              <w:t>Any participant that becomes a participant after 22 November 2025 must be a member of the AVP MX CUG.</w:t>
             </w:r>
           </w:p>
         </w:tc>
@@ -1737,7 +1748,7 @@
               </w:numPr>
             </w:pPr>
             <w:r>
-              <w:t>Hybrid Address Line formatting.</w:t>
+              <w:t>Hybrid Postal Address formatting.</w:t>
             </w:r>
           </w:p>
           <w:p>
@@ -2459,7 +2470,7 @@
         <w:tc>
           <w:p>
             <w:r>
-              <w:t>Information on how to prepare for the AVP MX CUG and the process to join the CUG is provided by the RBNZ Confluence website.</w:t>
+              <w:t>Information on how to prepare for the AVP MX CUG and the process to join the CUG is provided by the RBNZ.</w:t>
             </w:r>
           </w:p>
         </w:tc>
@@ -2602,7 +2613,7 @@
               <w:rPr>
                 <w:b/>
               </w:rPr>
-              <w:t>2.4 MT and MX CUG capabilities</w:t>
+              <w:t>2.4 MX CUG capabilities</w:t>
             </w:r>
           </w:p>
         </w:tc>
@@ -2696,14 +2707,6 @@
                     <w:rPr>
                       <w:b/>
                     </w:rPr>
-                    <w:t>MT Block 1, 2</w:t>
-                  </w:r>
-                </w:p>
-                <w:p>
-                  <w:r>
-                    <w:rPr>
-                      <w:b/>
-                    </w:rPr>
                     <w:t>MX InterAct Headers</w:t>
                   </w:r>
                 </w:p>
@@ -2729,14 +2732,6 @@
                 </w:p>
               </w:tc>
               <w:tc>
-                <w:p>
-                  <w:r>
-                    <w:rPr>
-                      <w:b/>
-                    </w:rPr>
-                    <w:t>MT Block 4</w:t>
-                  </w:r>
-                </w:p>
                 <w:p>
                   <w:r>
                     <w:rPr>
@@ -3228,7 +3223,18 @@
               </w:numPr>
             </w:pPr>
             <w:r>
-              <w:t>For MT messages that have been translated in-flow or in the Transaction Manager, SWIFT provides the delivery format “ISO 20022 with embedded MT”, this includes an indication of whether truncation has occurred and provides additional details of the truncation(s).</w:t>
+              <w:t>For MT messages that have been in-flow translated, SWIFT provides the delivery format “ISO 20022 with embedded MT”, this includes an indication of whether truncation has occurred and provides additional details of the truncation(s).</w:t>
+            </w:r>
+          </w:p>
+          <w:p>
+            <w:pPr>
+              <w:numPr>
+                <w:ilvl w:val="1"/>
+                <w:numId w:val="100"/>
+              </w:numPr>
+            </w:pPr>
+            <w:r>
+              <w:t>Intermediaries that use an MT Payments Processor must ensure that any payment message that is on-sent includes Debtor and Creditor information in the original MX form received as per the 'travel rule' requirements (FATF Recommendation 16 as adopted by the NZ Anti-Money Laundering and Countering Financing of Terrorism Act 2009 and associated Regulations).</w:t>
             </w:r>
           </w:p>
         </w:tc>
@@ -3304,7 +3310,12 @@
           </w:p>
           <w:p>
             <w:r>
-              <w:t>Payments NZ discussed with the ISO 20022 Industry and Operational Working Group (ORWG) that during the window immediately following go-live, Participants may receive MT payments from SWIFT that were held in a SWIFT outbound sanctions queue at the time of go-live 22 November. These may be any of the MT payment types or their return variants. Some Participants may be able to receive and process the incoming MT payment instruction; some may not and would be forced to reject the payment instruction. If the payment was accepted, and subsequently needed to be returned, it would have to be returned as a pacs.004.</w:t>
+              <w:t>Payments NZ discussed with the ISO 20022 Operations and Readines Working Group (ORWG) that during the window immediately following go-live, Participants may receive MT payments from SWIFT that were held in a SWIFT outbound sanctions queue at the time of go-live 22 November. These may be any of the MT payment types or their return variants.</w:t>
+            </w:r>
+          </w:p>
+          <w:p>
+            <w:r>
+              <w:t>Some Participants may be able to receive and process the incoming MT payment instruction; some may not and would be forced to reject the payment instruction. If the MT103 or MT202 payment was accepted, and subsequently needed to be returned, it would have to be returned as a pacs.004.  If an MT return payment is received in this manner after go-live and the original payment was required to be sent again it would have to be sent as an MX message.</w:t>
             </w:r>
           </w:p>
           <w:p>
@@ -3456,7 +3467,7 @@
               <w:t xml:space="preserve"> </w:t>
             </w:r>
             <w:r>
-              <w:t>receive and process the following MT payment messages from other participants for the Effective Term:</w:t>
+              <w:t>receive and process the following MT payment messages or their return (RETN) variants from other participants for the Effective Term:</w:t>
             </w:r>
             <w:r>
               <w:t xml:space="preserve"> </w:t>
@@ -3557,6 +3568,17 @@
             </w:pPr>
             <w:r>
               <w:t>if the original instructed agent receives a MT205 message, return by sending a pacs.004 message.</w:t>
+            </w:r>
+          </w:p>
+          <w:p>
+            <w:pPr>
+              <w:numPr>
+                <w:ilvl w:val="1"/>
+                <w:numId w:val="100"/>
+              </w:numPr>
+            </w:pPr>
+            <w:r>
+              <w:t>If return payment was received in MT message format during the Effective Term, and the payment requires resending, it must be sent as an MX message.</w:t>
             </w:r>
           </w:p>
         </w:tc>

</xml_diff>

<commit_message>
Removed comments and questions, applied document control updates.
</commit_message>
<xml_diff>
--- a/dist/docx/coexistence.docx
+++ b/dist/docx/coexistence.docx
@@ -555,6 +555,16 @@
           </w:p>
           <w:p>
             <w:r>
+              <w:t>in November 2026; or</w:t>
+            </w:r>
+          </w:p>
+          <w:p>
+            <w:r>
+              <w:t>as determined by Payments NZ if all participants have fully migrated to using MX messages prior to November 2026.</w:t>
+            </w:r>
+          </w:p>
+          <w:p>
+            <w:r>
               <w:rPr>
                 <w:b/>
               </w:rPr>
@@ -565,16 +575,6 @@
             </w:r>
             <w:r>
               <w:t>formatting means when the content of the address information within an MX message is formatted in accordance with the hybrid data requirements set out in the MX Message Specifications.</w:t>
-            </w:r>
-          </w:p>
-          <w:p>
-            <w:r>
-              <w:t>in November 2026; or</w:t>
-            </w:r>
-          </w:p>
-          <w:p>
-            <w:r>
-              <w:t>as determined by Payments NZ if all participants have fully migrated to using MX messages prior to November 2026.</w:t>
             </w:r>
           </w:p>
           <w:p>
@@ -3116,7 +3116,7 @@
               </w:numPr>
             </w:pPr>
             <w:r>
-              <w:t>At the end of the co-existence phase, the capability to send CBPR+ messages containing Unstructured Address formatting will be removed from the CBPR+ Usage Guidelines. Therefore, by the end of the co-existence phase, all participants that act as intermediaries must be able to send and receive CBPR+ messages containing wither Structured Postal Address formatting or Hybrid Postal Address formatting.</w:t>
+              <w:t>At the end of the co-existence phase, the capability to send CBPR+ messages containing Unstructured Address Line formatting will be removed from the CBPR+ Usage Guidelines. Therefore, by the end of the co-existence phase, all participants that act as intermediaries must be able to send and receive CBPR+ messages containing either Structured Postal Address formatting or Hybrid Postal Address formatting.</w:t>
             </w:r>
           </w:p>
         </w:tc>

</xml_diff>